<commit_message>
docs: registra a sessão 3 (DevOps, Docker, GitHub, equipe) em toda a documentação
- PROJECT_CONTEXT: nova seção 'Sessão 3', versões, execução, decisões, pendências
- DOCS: stack (Node 24, Python 3.13, ESLint 10), árvore real de arquivos,
  variáveis de ambiente, Docker, testes, infraestrutura/CI e dependências
- ARCHITECTURE: containers, esteira CI/CD, segurança, pendências
- BACKLOG_KANBAN: board real, automações, criar branch pelo card
- COLABORACAO_EQUIPE: ruleset como configurado; EXERCICIO: execução real (#16-#19)
- Corrige descrição das sessões: tabela sessoes no PostgreSQL, não Map em memória
- CLAUDE.md (stack) e STATUS (card #29 do Dev 2)

Co-Authored-By: Claude Opus 5.5 <noreply@anthropic.com>
</commit_message>
<xml_diff>
--- a/docs/BACKLOG_KANBAN.docx
+++ b/docs/BACKLOG_KANBAN.docx
@@ -2,7 +2,7 @@
 <file path=word/document.xml><?xml version="1.0" encoding="utf-8"?>
 <w:document xmlns:w="http://schemas.openxmlformats.org/wordprocessingml/2006/main" xmlns:m="http://schemas.openxmlformats.org/officeDocument/2006/math" xmlns:r="http://schemas.openxmlformats.org/officeDocument/2006/relationships" xmlns:o="urn:schemas-microsoft-com:office:office" xmlns:v="urn:schemas-microsoft-com:vml" xmlns:w10="urn:schemas-microsoft-com:office:word" xmlns:a="http://schemas.openxmlformats.org/drawingml/2006/main" xmlns:pic="http://schemas.openxmlformats.org/drawingml/2006/picture" xmlns:wp="http://schemas.openxmlformats.org/drawingml/2006/wordprocessingDrawing">
   <w:body>
-    <w:bookmarkStart w:id="14" w:name="backlog-e-board-kanban-github-projects"/>
+    <w:bookmarkStart w:id="17" w:name="backlog-e-board-kanban-github-projects"/>
     <w:p>
       <w:pPr>
         <w:pStyle w:val="Heading1"/>
@@ -861,7 +861,558 @@
       </w:r>
     </w:p>
     <w:bookmarkEnd w:id="13"/>
-    <w:bookmarkEnd w:id="14"/>
+    <w:bookmarkStart w:id="16" w:name="Xc9db0e3420453ca3a0a0ff0645f4a1c3eda7aef"/>
+    <w:p>
+      <w:pPr>
+        <w:pStyle w:val="Heading2"/>
+      </w:pPr>
+      <w:r>
+        <w:t xml:space="preserve">6. O board deste repositório (como está configurado)</w:t>
+      </w:r>
+    </w:p>
+    <w:p>
+      <w:pPr>
+        <w:pStyle w:val="Compact"/>
+        <w:numPr>
+          <w:ilvl w:val="0"/>
+          <w:numId w:val="1005"/>
+        </w:numPr>
+      </w:pPr>
+      <w:r>
+        <w:rPr>
+          <w:b/>
+          <w:bCs/>
+        </w:rPr>
+        <w:t xml:space="preserve">Board:</w:t>
+      </w:r>
+      <w:r>
+        <w:t xml:space="preserve"> </w:t>
+      </w:r>
+      <w:hyperlink r:id="rId14">
+        <w:r>
+          <w:rPr>
+            <w:rStyle w:val="Hyperlink"/>
+          </w:rPr>
+          <w:t xml:space="preserve">https://github.com/users/ScaTecnologia/projects/2</w:t>
+        </w:r>
+      </w:hyperlink>
+      <w:r>
+        <w:t xml:space="preserve"> </w:t>
+      </w:r>
+      <w:r>
+        <w:t xml:space="preserve">— "LabSystem — Esteira", vinculado ao repositório.</w:t>
+      </w:r>
+    </w:p>
+    <w:p>
+      <w:pPr>
+        <w:pStyle w:val="Compact"/>
+        <w:numPr>
+          <w:ilvl w:val="0"/>
+          <w:numId w:val="1005"/>
+        </w:numPr>
+      </w:pPr>
+      <w:r>
+        <w:rPr>
+          <w:b/>
+          <w:bCs/>
+        </w:rPr>
+        <w:t xml:space="preserve">Colunas (campo Status):</w:t>
+      </w:r>
+      <w:r>
+        <w:t xml:space="preserve"> </w:t>
+      </w:r>
+      <w:r>
+        <w:t xml:space="preserve">Backlog · To Do · Em Progresso · Em Revisão · Concluído.</w:t>
+      </w:r>
+    </w:p>
+    <w:p>
+      <w:pPr>
+        <w:pStyle w:val="Compact"/>
+        <w:numPr>
+          <w:ilvl w:val="0"/>
+          <w:numId w:val="1005"/>
+        </w:numPr>
+      </w:pPr>
+      <w:r>
+        <w:rPr>
+          <w:b/>
+          <w:bCs/>
+        </w:rPr>
+        <w:t xml:space="preserve">Automações nativas ligadas</w:t>
+      </w:r>
+      <w:r>
+        <w:t xml:space="preserve"> </w:t>
+      </w:r>
+      <w:r>
+        <w:t xml:space="preserve">(projeto → ⋯ → Workflows):</w:t>
+      </w:r>
+      <w:r>
+        <w:t xml:space="preserve"> </w:t>
+      </w:r>
+      <w:r>
+        <w:rPr>
+          <w:i/>
+          <w:iCs/>
+        </w:rPr>
+        <w:t xml:space="preserve">Item added to project</w:t>
+      </w:r>
+      <w:r>
+        <w:t xml:space="preserve"> </w:t>
+      </w:r>
+      <w:r>
+        <w:t xml:space="preserve">(entra em</w:t>
+      </w:r>
+      <w:r>
+        <w:t xml:space="preserve"> </w:t>
+      </w:r>
+      <w:r>
+        <w:rPr>
+          <w:b/>
+          <w:bCs/>
+        </w:rPr>
+        <w:t xml:space="preserve">To Do</w:t>
+      </w:r>
+      <w:r>
+        <w:t xml:space="preserve">),</w:t>
+      </w:r>
+      <w:r>
+        <w:t xml:space="preserve"> </w:t>
+      </w:r>
+      <w:r>
+        <w:rPr>
+          <w:i/>
+          <w:iCs/>
+        </w:rPr>
+        <w:t xml:space="preserve">Pull request linked to issue</w:t>
+      </w:r>
+      <w:r>
+        <w:t xml:space="preserve"> </w:t>
+      </w:r>
+      <w:r>
+        <w:t xml:space="preserve">(→</w:t>
+      </w:r>
+      <w:r>
+        <w:t xml:space="preserve"> </w:t>
+      </w:r>
+      <w:r>
+        <w:rPr>
+          <w:b/>
+          <w:bCs/>
+        </w:rPr>
+        <w:t xml:space="preserve">Em Revisão</w:t>
+      </w:r>
+      <w:r>
+        <w:t xml:space="preserve">),</w:t>
+      </w:r>
+      <w:r>
+        <w:t xml:space="preserve"> </w:t>
+      </w:r>
+      <w:r>
+        <w:rPr>
+          <w:i/>
+          <w:iCs/>
+        </w:rPr>
+        <w:t xml:space="preserve">Pull request merged</w:t>
+      </w:r>
+      <w:r>
+        <w:t xml:space="preserve"> </w:t>
+      </w:r>
+      <w:r>
+        <w:t xml:space="preserve">e</w:t>
+      </w:r>
+      <w:r>
+        <w:t xml:space="preserve"> </w:t>
+      </w:r>
+      <w:r>
+        <w:rPr>
+          <w:i/>
+          <w:iCs/>
+        </w:rPr>
+        <w:t xml:space="preserve">Item closed</w:t>
+      </w:r>
+      <w:r>
+        <w:t xml:space="preserve"> </w:t>
+      </w:r>
+      <w:r>
+        <w:t xml:space="preserve">(→</w:t>
+      </w:r>
+      <w:r>
+        <w:t xml:space="preserve"> </w:t>
+      </w:r>
+      <w:r>
+        <w:rPr>
+          <w:b/>
+          <w:bCs/>
+        </w:rPr>
+        <w:t xml:space="preserve">Concluído</w:t>
+      </w:r>
+      <w:r>
+        <w:t xml:space="preserve">),</w:t>
+      </w:r>
+      <w:r>
+        <w:t xml:space="preserve"> </w:t>
+      </w:r>
+      <w:r>
+        <w:rPr>
+          <w:i/>
+          <w:iCs/>
+        </w:rPr>
+        <w:t xml:space="preserve">Auto-close issue</w:t>
+      </w:r>
+      <w:r>
+        <w:t xml:space="preserve">,</w:t>
+      </w:r>
+      <w:r>
+        <w:t xml:space="preserve"> </w:t>
+      </w:r>
+      <w:r>
+        <w:rPr>
+          <w:i/>
+          <w:iCs/>
+        </w:rPr>
+        <w:t xml:space="preserve">Auto-add sub-issues</w:t>
+      </w:r>
+      <w:r>
+        <w:t xml:space="preserve">.</w:t>
+      </w:r>
+    </w:p>
+    <w:p>
+      <w:pPr>
+        <w:pStyle w:val="Compact"/>
+        <w:numPr>
+          <w:ilvl w:val="0"/>
+          <w:numId w:val="1005"/>
+        </w:numPr>
+      </w:pPr>
+      <w:r>
+        <w:rPr>
+          <w:b/>
+          <w:bCs/>
+        </w:rPr>
+        <w:t xml:space="preserve">Criar um card:</w:t>
+      </w:r>
+      <w:r>
+        <w:t xml:space="preserve"> </w:t>
+      </w:r>
+      <w:hyperlink r:id="rId15">
+        <w:r>
+          <w:rPr>
+            <w:rStyle w:val="Hyperlink"/>
+          </w:rPr>
+          <w:t xml:space="preserve">https://github.com/ScaTecnologia/laboratorio-claude-code/issues/new/choose</w:t>
+        </w:r>
+      </w:hyperlink>
+      <w:r>
+        <w:t xml:space="preserve"> </w:t>
+      </w:r>
+      <w:r>
+        <w:t xml:space="preserve">→ modelo</w:t>
+      </w:r>
+      <w:r>
+        <w:t xml:space="preserve"> </w:t>
+      </w:r>
+      <w:r>
+        <w:rPr>
+          <w:b/>
+          <w:bCs/>
+        </w:rPr>
+        <w:t xml:space="preserve">Tarefa</w:t>
+      </w:r>
+      <w:r>
+        <w:t xml:space="preserve"> </w:t>
+      </w:r>
+      <w:r>
+        <w:t xml:space="preserve">(aplica o rótulo</w:t>
+      </w:r>
+      <w:r>
+        <w:t xml:space="preserve"> </w:t>
+      </w:r>
+      <w:r>
+        <w:rPr>
+          <w:rStyle w:val="VerbatimChar"/>
+        </w:rPr>
+        <w:t xml:space="preserve">tarefa</w:t>
+      </w:r>
+      <w:r>
+        <w:t xml:space="preserve">) ou</w:t>
+      </w:r>
+      <w:r>
+        <w:t xml:space="preserve"> </w:t>
+      </w:r>
+      <w:r>
+        <w:rPr>
+          <w:b/>
+          <w:bCs/>
+        </w:rPr>
+        <w:t xml:space="preserve">Bug</w:t>
+      </w:r>
+      <w:r>
+        <w:t xml:space="preserve">. Se o card não aparecer no board, adicione pela lateral da issue (</w:t>
+      </w:r>
+      <w:r>
+        <w:rPr>
+          <w:i/>
+          <w:iCs/>
+        </w:rPr>
+        <w:t xml:space="preserve">Projects</w:t>
+      </w:r>
+      <w:r>
+        <w:t xml:space="preserve">).</w:t>
+      </w:r>
+    </w:p>
+    <w:p>
+      <w:pPr>
+        <w:pStyle w:val="Compact"/>
+        <w:numPr>
+          <w:ilvl w:val="0"/>
+          <w:numId w:val="1005"/>
+        </w:numPr>
+      </w:pPr>
+      <w:r>
+        <w:rPr>
+          <w:b/>
+          <w:bCs/>
+        </w:rPr>
+        <w:t xml:space="preserve">Pegar o card e criar a branch sem sair do GitHub:</w:t>
+      </w:r>
+      <w:r>
+        <w:t xml:space="preserve"> </w:t>
+      </w:r>
+      <w:r>
+        <w:t xml:space="preserve">na issue,</w:t>
+      </w:r>
+      <w:r>
+        <w:t xml:space="preserve"> </w:t>
+      </w:r>
+      <w:r>
+        <w:rPr>
+          <w:i/>
+          <w:iCs/>
+        </w:rPr>
+        <w:t xml:space="preserve">Assignees</w:t>
+      </w:r>
+      <w:r>
+        <w:t xml:space="preserve"> </w:t>
+      </w:r>
+      <w:r>
+        <w:t xml:space="preserve">→ você; depois</w:t>
+      </w:r>
+      <w:r>
+        <w:t xml:space="preserve"> </w:t>
+      </w:r>
+      <w:r>
+        <w:rPr>
+          <w:i/>
+          <w:iCs/>
+        </w:rPr>
+        <w:t xml:space="preserve">Development → Create a branch</w:t>
+      </w:r>
+      <w:r>
+        <w:t xml:space="preserve">. O GitHub sugere o nome (ex.:</w:t>
+      </w:r>
+      <w:r>
+        <w:t xml:space="preserve"> </w:t>
+      </w:r>
+      <w:r>
+        <w:rPr>
+          <w:rStyle w:val="VerbatimChar"/>
+        </w:rPr>
+        <w:t xml:space="preserve">27-mostrar-a-quantidade...</w:t>
+      </w:r>
+      <w:r>
+        <w:t xml:space="preserve">), já liga a branch à issue e mostra o comando:</w:t>
+      </w:r>
+    </w:p>
+    <w:p>
+      <w:pPr>
+        <w:pStyle w:val="SourceCode"/>
+        <w:numPr>
+          <w:ilvl w:val="0"/>
+          <w:numId w:val="1000"/>
+        </w:numPr>
+      </w:pPr>
+      <w:r>
+        <w:rPr>
+          <w:rStyle w:val="FunctionTok"/>
+        </w:rPr>
+        <w:t xml:space="preserve">git</w:t>
+      </w:r>
+      <w:r>
+        <w:rPr>
+          <w:rStyle w:val="NormalTok"/>
+        </w:rPr>
+        <w:t xml:space="preserve"> fetch origin</w:t>
+      </w:r>
+      <w:r>
+        <w:br/>
+      </w:r>
+      <w:r>
+        <w:rPr>
+          <w:rStyle w:val="FunctionTok"/>
+        </w:rPr>
+        <w:t xml:space="preserve">git</w:t>
+      </w:r>
+      <w:r>
+        <w:rPr>
+          <w:rStyle w:val="NormalTok"/>
+        </w:rPr>
+        <w:t xml:space="preserve"> checkout </w:t>
+      </w:r>
+      <w:r>
+        <w:rPr>
+          <w:rStyle w:val="OperatorTok"/>
+        </w:rPr>
+        <w:t xml:space="preserve">&lt;</w:t>
+      </w:r>
+      <w:r>
+        <w:rPr>
+          <w:rStyle w:val="NormalTok"/>
+        </w:rPr>
+        <w:t xml:space="preserve">nome-da-branch</w:t>
+      </w:r>
+      <w:r>
+        <w:rPr>
+          <w:rStyle w:val="OperatorTok"/>
+        </w:rPr>
+        <w:t xml:space="preserve">&gt;</w:t>
+      </w:r>
+    </w:p>
+    <w:p>
+      <w:pPr>
+        <w:pStyle w:val="Compact"/>
+        <w:numPr>
+          <w:ilvl w:val="0"/>
+          <w:numId w:val="1005"/>
+        </w:numPr>
+      </w:pPr>
+      <w:r>
+        <w:rPr>
+          <w:b/>
+          <w:bCs/>
+        </w:rPr>
+        <w:t xml:space="preserve">Fechar o ciclo:</w:t>
+      </w:r>
+      <w:r>
+        <w:t xml:space="preserve"> </w:t>
+      </w:r>
+      <w:r>
+        <w:t xml:space="preserve">PR com</w:t>
+      </w:r>
+      <w:r>
+        <w:t xml:space="preserve"> </w:t>
+      </w:r>
+      <w:r>
+        <w:rPr>
+          <w:rStyle w:val="VerbatimChar"/>
+        </w:rPr>
+        <w:t xml:space="preserve">Resolve #&lt;número&gt;</w:t>
+      </w:r>
+      <w:r>
+        <w:t xml:space="preserve"> </w:t>
+      </w:r>
+      <w:r>
+        <w:t xml:space="preserve">na descrição → card vai para</w:t>
+      </w:r>
+      <w:r>
+        <w:t xml:space="preserve"> </w:t>
+      </w:r>
+      <w:r>
+        <w:rPr>
+          <w:b/>
+          <w:bCs/>
+        </w:rPr>
+        <w:t xml:space="preserve">Em Revisão</w:t>
+      </w:r>
+      <w:r>
+        <w:t xml:space="preserve">; merge → issue fecha e card vai para</w:t>
+      </w:r>
+      <w:r>
+        <w:t xml:space="preserve"> </w:t>
+      </w:r>
+      <w:r>
+        <w:rPr>
+          <w:b/>
+          <w:bCs/>
+        </w:rPr>
+        <w:t xml:space="preserve">Concluído</w:t>
+      </w:r>
+      <w:r>
+        <w:t xml:space="preserve">.</w:t>
+      </w:r>
+    </w:p>
+    <w:p>
+      <w:pPr>
+        <w:pStyle w:val="FirstParagraph"/>
+      </w:pPr>
+      <w:r>
+        <w:t xml:space="preserve">Pelo terminal, o</w:t>
+      </w:r>
+      <w:r>
+        <w:t xml:space="preserve"> </w:t>
+      </w:r>
+      <w:r>
+        <w:rPr>
+          <w:rStyle w:val="VerbatimChar"/>
+        </w:rPr>
+        <w:t xml:space="preserve">gh</w:t>
+      </w:r>
+      <w:r>
+        <w:t xml:space="preserve"> </w:t>
+      </w:r>
+      <w:r>
+        <w:t xml:space="preserve">faz o mesmo (útil para automatizar):</w:t>
+      </w:r>
+      <w:r>
+        <w:t xml:space="preserve"> </w:t>
+      </w:r>
+      <w:r>
+        <w:rPr>
+          <w:rStyle w:val="VerbatimChar"/>
+        </w:rPr>
+        <w:t xml:space="preserve">gh issue create</w:t>
+      </w:r>
+      <w:r>
+        <w:t xml:space="preserve">,</w:t>
+      </w:r>
+      <w:r>
+        <w:t xml:space="preserve"> </w:t>
+      </w:r>
+      <w:r>
+        <w:rPr>
+          <w:rStyle w:val="VerbatimChar"/>
+        </w:rPr>
+        <w:t xml:space="preserve">gh issue edit &lt;n&gt; --add-assignee @me</w:t>
+      </w:r>
+      <w:r>
+        <w:t xml:space="preserve">,</w:t>
+      </w:r>
+      <w:r>
+        <w:t xml:space="preserve"> </w:t>
+      </w:r>
+      <w:r>
+        <w:rPr>
+          <w:rStyle w:val="VerbatimChar"/>
+        </w:rPr>
+        <w:t xml:space="preserve">gh issue develop &lt;n&gt; --checkout</w:t>
+      </w:r>
+      <w:r>
+        <w:t xml:space="preserve">,</w:t>
+      </w:r>
+      <w:r>
+        <w:t xml:space="preserve"> </w:t>
+      </w:r>
+      <w:r>
+        <w:rPr>
+          <w:rStyle w:val="VerbatimChar"/>
+        </w:rPr>
+        <w:t xml:space="preserve">gh pr create</w:t>
+      </w:r>
+      <w:r>
+        <w:t xml:space="preserve">.</w:t>
+      </w:r>
+    </w:p>
+    <w:bookmarkEnd w:id="16"/>
+    <w:bookmarkEnd w:id="17"/>
     <w:sectPr>
       <w:footnotePr>
         <w:numRestart w:val="eachSect"/>
@@ -1312,6 +1863,9 @@
     </w:lvlOverride>
   </w:num>
   <w:num w:numId="1004">
+    <w:abstractNumId w:val="991"/>
+  </w:num>
+  <w:num w:numId="1005">
     <w:abstractNumId w:val="991"/>
   </w:num>
 </w:numbering>

</xml_diff>